<commit_message>
Add feature to show specific type and handle some errors
</commit_message>
<xml_diff>
--- a/Personal Finance Tracker.docx
+++ b/Personal Finance Tracker.docx
@@ -68,6 +68,31 @@
         <w:t>First commit</w:t>
       </w:r>
       <w:r>
+        <w:t xml:space="preserve"> </w:t>
+      </w:r>
+      <w:hyperlink r:id="rId5" w:history="1">
+        <w:r>
+          <w:rPr>
+            <w:rStyle w:val="ae"/>
+          </w:rPr>
+          <w:t xml:space="preserve">Handle view error · </w:t>
+        </w:r>
+        <w:proofErr w:type="spellStart"/>
+        <w:r>
+          <w:rPr>
+            <w:rStyle w:val="ae"/>
+          </w:rPr>
+          <w:t>nemoirisgurl</w:t>
+        </w:r>
+        <w:proofErr w:type="spellEnd"/>
+        <w:r>
+          <w:rPr>
+            <w:rStyle w:val="ae"/>
+          </w:rPr>
+          <w:t>/finance@0abb1cf</w:t>
+        </w:r>
+      </w:hyperlink>
+      <w:r>
         <w:br/>
         <w:t>- Created table “</w:t>
       </w:r>
@@ -77,7 +102,110 @@
       <w:r>
         <w:t>”</w:t>
       </w:r>
+      <w:r>
+        <w:t xml:space="preserve"> which had Id as a primary key</w:t>
+      </w:r>
+      <w:r>
+        <w:t xml:space="preserve"> and other attributes.</w:t>
+      </w:r>
     </w:p>
+    <w:p>
+      <w:r>
+        <w:rPr>
+          <w:u w:val="single"/>
+        </w:rPr>
+        <w:t>Id</w:t>
+      </w:r>
+      <w:r>
+        <w:t xml:space="preserve"> | name | type | amount | date</w:t>
+      </w:r>
+    </w:p>
+    <w:p>
+      <w:r>
+        <w:t xml:space="preserve">CREATE TABLE IF NOT EXISTS </w:t>
+      </w:r>
+      <w:proofErr w:type="gramStart"/>
+      <w:r>
+        <w:t>transactions(</w:t>
+      </w:r>
+      <w:proofErr w:type="gramEnd"/>
+    </w:p>
+    <w:p>
+      <w:r>
+        <w:t>    id INTEGER PRIMARY KEY,</w:t>
+      </w:r>
+    </w:p>
+    <w:p>
+      <w:r>
+        <w:t xml:space="preserve">    </w:t>
+      </w:r>
+      <w:proofErr w:type="spellStart"/>
+      <w:r>
+        <w:t>transaction_name</w:t>
+      </w:r>
+      <w:proofErr w:type="spellEnd"/>
+      <w:r>
+        <w:t xml:space="preserve"> TEXT,</w:t>
+      </w:r>
+    </w:p>
+    <w:p>
+      <w:r>
+        <w:t xml:space="preserve">    </w:t>
+      </w:r>
+      <w:proofErr w:type="spellStart"/>
+      <w:r>
+        <w:t>transaction_type</w:t>
+      </w:r>
+      <w:proofErr w:type="spellEnd"/>
+      <w:r>
+        <w:t xml:space="preserve"> TEXT CHECK (</w:t>
+      </w:r>
+      <w:proofErr w:type="spellStart"/>
+      <w:r>
+        <w:t>transaction_type</w:t>
+      </w:r>
+      <w:proofErr w:type="spellEnd"/>
+      <w:r>
+        <w:t xml:space="preserve"> IN ('income', '</w:t>
+      </w:r>
+      <w:proofErr w:type="gramStart"/>
+      <w:r>
+        <w:t>expense')</w:t>
+      </w:r>
+      <w:proofErr w:type="gramEnd"/>
+      <w:r>
+        <w:t>),</w:t>
+      </w:r>
+    </w:p>
+    <w:p>
+      <w:r>
+        <w:t>    amount REAL,</w:t>
+      </w:r>
+    </w:p>
+    <w:p>
+      <w:r>
+        <w:t xml:space="preserve">    </w:t>
+      </w:r>
+      <w:proofErr w:type="spellStart"/>
+      <w:r>
+        <w:t>transaction_date</w:t>
+      </w:r>
+      <w:proofErr w:type="spellEnd"/>
+      <w:r>
+        <w:t xml:space="preserve"> TEXT DEFAULT CURRENT_DATE</w:t>
+      </w:r>
+    </w:p>
+    <w:p>
+      <w:r>
+        <w:t>);</w:t>
+      </w:r>
+    </w:p>
+    <w:p>
+      <w:r>
+        <w:t>-Add basic view/add rows to transactions table with python and sqlite3 library.</w:t>
+      </w:r>
+    </w:p>
+    <w:p/>
     <w:sectPr>
       <w:pgSz w:w="12240" w:h="15840"/>
       <w:pgMar w:top="1440" w:right="1440" w:bottom="1440" w:left="1440" w:header="720" w:footer="720" w:gutter="0"/>
@@ -86,6 +214,126 @@
     </w:sectPr>
   </w:body>
 </w:document>
+</file>
+
+<file path=word/numbering.xml><?xml version="1.0" encoding="utf-8"?>
+<w:numbering xmlns:wpc="http://schemas.microsoft.com/office/word/2010/wordprocessingCanvas" xmlns:cx="http://schemas.microsoft.com/office/drawing/2014/chartex" xmlns:cx1="http://schemas.microsoft.com/office/drawing/2015/9/8/chartex" xmlns:cx2="http://schemas.microsoft.com/office/drawing/2015/10/21/chartex" xmlns:cx3="http://schemas.microsoft.com/office/drawing/2016/5/9/chartex" xmlns:cx4="http://schemas.microsoft.com/office/drawing/2016/5/10/chartex" xmlns:cx5="http://schemas.microsoft.com/office/drawing/2016/5/11/chartex" xmlns:cx6="http://schemas.microsoft.com/office/drawing/2016/5/12/chartex" xmlns:cx7="http://schemas.microsoft.com/office/drawing/2016/5/13/chartex" xmlns:cx8="http://schemas.microsoft.com/office/drawing/2016/5/14/chartex" xmlns:mc="http://schemas.openxmlformats.org/markup-compatibility/2006" xmlns:aink="http://schemas.microsoft.com/office/drawing/2016/ink" xmlns:am3d="http://schemas.microsoft.com/office/drawing/2017/model3d" xmlns:o="urn:schemas-microsoft-com:office:office" xmlns:oel="http://schemas.microsoft.com/office/2019/extlst" xmlns:r="http://schemas.openxmlformats.org/officeDocument/2006/relationships" xmlns:m="http://schemas.openxmlformats.org/officeDocument/2006/math" xmlns:v="urn:schemas-microsoft-com:vml" xmlns:wp14="http://schemas.microsoft.com/office/word/2010/wordprocessingDrawing" xmlns:wp="http://schemas.openxmlformats.org/drawingml/2006/wordprocessingDrawing" xmlns:w10="urn:schemas-microsoft-com:office:word" xmlns:w="http://schemas.openxmlformats.org/wordprocessingml/2006/main" xmlns:w14="http://schemas.microsoft.com/office/word/2010/wordml" xmlns:w15="http://schemas.microsoft.com/office/word/2012/wordml" xmlns:w16cex="http://schemas.microsoft.com/office/word/2018/wordml/cex" xmlns:w16cid="http://schemas.microsoft.com/office/word/2016/wordml/cid" xmlns:w16="http://schemas.microsoft.com/office/word/2018/wordml" xmlns:w16du="http://schemas.microsoft.com/office/word/2023/wordml/word16du" xmlns:w16sdtdh="http://schemas.microsoft.com/office/word/2020/wordml/sdtdatahash" xmlns:w16sdtfl="http://schemas.microsoft.com/office/word/2024/wordml/sdtformatlock" xmlns:w16se="http://schemas.microsoft.com/office/word/2015/wordml/symex" xmlns:wpg="http://schemas.microsoft.com/office/word/2010/wordprocessingGroup" xmlns:wpi="http://schemas.microsoft.com/office/word/2010/wordprocessingInk" xmlns:wne="http://schemas.microsoft.com/office/word/2006/wordml" xmlns:wps="http://schemas.microsoft.com/office/word/2010/wordprocessingShape" mc:Ignorable="w14 w15 w16se w16cid w16 w16cex w16sdtdh w16sdtfl w16du wp14">
+  <w:abstractNum w:abstractNumId="0" w15:restartNumberingAfterBreak="0">
+    <w:nsid w:val="10B064EC"/>
+    <w:multiLevelType w:val="hybridMultilevel"/>
+    <w:tmpl w:val="2E6E7784"/>
+    <w:lvl w:ilvl="0" w:tplc="4880A30A">
+      <w:numFmt w:val="bullet"/>
+      <w:lvlText w:val="-"/>
+      <w:lvlJc w:val="left"/>
+      <w:pPr>
+        <w:ind w:left="720" w:hanging="360"/>
+      </w:pPr>
+      <w:rPr>
+        <w:rFonts w:ascii="Aptos" w:eastAsiaTheme="minorHAnsi" w:hAnsi="Aptos" w:cstheme="minorBidi" w:hint="default"/>
+      </w:rPr>
+    </w:lvl>
+    <w:lvl w:ilvl="1" w:tplc="04090003" w:tentative="1">
+      <w:start w:val="1"/>
+      <w:numFmt w:val="bullet"/>
+      <w:lvlText w:val="o"/>
+      <w:lvlJc w:val="left"/>
+      <w:pPr>
+        <w:ind w:left="1440" w:hanging="360"/>
+      </w:pPr>
+      <w:rPr>
+        <w:rFonts w:ascii="Courier New" w:hAnsi="Courier New" w:cs="Courier New" w:hint="default"/>
+      </w:rPr>
+    </w:lvl>
+    <w:lvl w:ilvl="2" w:tplc="04090005" w:tentative="1">
+      <w:start w:val="1"/>
+      <w:numFmt w:val="bullet"/>
+      <w:lvlText w:val=""/>
+      <w:lvlJc w:val="left"/>
+      <w:pPr>
+        <w:ind w:left="2160" w:hanging="360"/>
+      </w:pPr>
+      <w:rPr>
+        <w:rFonts w:ascii="Wingdings" w:hAnsi="Wingdings" w:hint="default"/>
+      </w:rPr>
+    </w:lvl>
+    <w:lvl w:ilvl="3" w:tplc="04090001" w:tentative="1">
+      <w:start w:val="1"/>
+      <w:numFmt w:val="bullet"/>
+      <w:lvlText w:val=""/>
+      <w:lvlJc w:val="left"/>
+      <w:pPr>
+        <w:ind w:left="2880" w:hanging="360"/>
+      </w:pPr>
+      <w:rPr>
+        <w:rFonts w:ascii="Symbol" w:hAnsi="Symbol" w:hint="default"/>
+      </w:rPr>
+    </w:lvl>
+    <w:lvl w:ilvl="4" w:tplc="04090003" w:tentative="1">
+      <w:start w:val="1"/>
+      <w:numFmt w:val="bullet"/>
+      <w:lvlText w:val="o"/>
+      <w:lvlJc w:val="left"/>
+      <w:pPr>
+        <w:ind w:left="3600" w:hanging="360"/>
+      </w:pPr>
+      <w:rPr>
+        <w:rFonts w:ascii="Courier New" w:hAnsi="Courier New" w:cs="Courier New" w:hint="default"/>
+      </w:rPr>
+    </w:lvl>
+    <w:lvl w:ilvl="5" w:tplc="04090005" w:tentative="1">
+      <w:start w:val="1"/>
+      <w:numFmt w:val="bullet"/>
+      <w:lvlText w:val=""/>
+      <w:lvlJc w:val="left"/>
+      <w:pPr>
+        <w:ind w:left="4320" w:hanging="360"/>
+      </w:pPr>
+      <w:rPr>
+        <w:rFonts w:ascii="Wingdings" w:hAnsi="Wingdings" w:hint="default"/>
+      </w:rPr>
+    </w:lvl>
+    <w:lvl w:ilvl="6" w:tplc="04090001" w:tentative="1">
+      <w:start w:val="1"/>
+      <w:numFmt w:val="bullet"/>
+      <w:lvlText w:val=""/>
+      <w:lvlJc w:val="left"/>
+      <w:pPr>
+        <w:ind w:left="5040" w:hanging="360"/>
+      </w:pPr>
+      <w:rPr>
+        <w:rFonts w:ascii="Symbol" w:hAnsi="Symbol" w:hint="default"/>
+      </w:rPr>
+    </w:lvl>
+    <w:lvl w:ilvl="7" w:tplc="04090003" w:tentative="1">
+      <w:start w:val="1"/>
+      <w:numFmt w:val="bullet"/>
+      <w:lvlText w:val="o"/>
+      <w:lvlJc w:val="left"/>
+      <w:pPr>
+        <w:ind w:left="5760" w:hanging="360"/>
+      </w:pPr>
+      <w:rPr>
+        <w:rFonts w:ascii="Courier New" w:hAnsi="Courier New" w:cs="Courier New" w:hint="default"/>
+      </w:rPr>
+    </w:lvl>
+    <w:lvl w:ilvl="8" w:tplc="04090005" w:tentative="1">
+      <w:start w:val="1"/>
+      <w:numFmt w:val="bullet"/>
+      <w:lvlText w:val=""/>
+      <w:lvlJc w:val="left"/>
+      <w:pPr>
+        <w:ind w:left="6480" w:hanging="360"/>
+      </w:pPr>
+      <w:rPr>
+        <w:rFonts w:ascii="Wingdings" w:hAnsi="Wingdings" w:hint="default"/>
+      </w:rPr>
+    </w:lvl>
+  </w:abstractNum>
+  <w:num w:numId="1" w16cid:durableId="2101755658">
+    <w:abstractNumId w:val="0"/>
+  </w:num>
+</w:numbering>
 </file>
 
 <file path=word/styles.xml><?xml version="1.0" encoding="utf-8"?>
@@ -488,6 +736,7 @@
   <w:style w:type="paragraph" w:default="1" w:styleId="a">
     <w:name w:val="Normal"/>
     <w:qFormat/>
+    <w:rsid w:val="00087CBB"/>
   </w:style>
   <w:style w:type="paragraph" w:styleId="1">
     <w:name w:val="heading 1"/>
@@ -691,7 +940,6 @@
   <w:style w:type="character" w:default="1" w:styleId="a0">
     <w:name w:val="Default Paragraph Font"/>
     <w:uiPriority w:val="1"/>
-    <w:semiHidden/>
     <w:unhideWhenUsed/>
   </w:style>
   <w:style w:type="table" w:default="1" w:styleId="a1">
@@ -1003,6 +1251,29 @@
       <w:smallCaps/>
       <w:color w:val="0F4761" w:themeColor="accent1" w:themeShade="BF"/>
       <w:spacing w:val="5"/>
+    </w:rPr>
+  </w:style>
+  <w:style w:type="character" w:styleId="ae">
+    <w:name w:val="Hyperlink"/>
+    <w:basedOn w:val="a0"/>
+    <w:uiPriority w:val="99"/>
+    <w:unhideWhenUsed/>
+    <w:rsid w:val="00087CBB"/>
+    <w:rPr>
+      <w:color w:val="467886" w:themeColor="hyperlink"/>
+      <w:u w:val="single"/>
+    </w:rPr>
+  </w:style>
+  <w:style w:type="character" w:styleId="af">
+    <w:name w:val="Unresolved Mention"/>
+    <w:basedOn w:val="a0"/>
+    <w:uiPriority w:val="99"/>
+    <w:semiHidden/>
+    <w:unhideWhenUsed/>
+    <w:rsid w:val="00087CBB"/>
+    <w:rPr>
+      <w:color w:val="605E5C"/>
+      <w:shd w:val="clear" w:color="auto" w:fill="E1DFDD"/>
     </w:rPr>
   </w:style>
 </w:styles>

</xml_diff>

<commit_message>
Calculate balance from date
</commit_message>
<xml_diff>
--- a/Personal Finance Tracker.docx
+++ b/Personal Finance Tracker.docx
@@ -94,13 +94,7 @@
       </w:hyperlink>
       <w:r>
         <w:br/>
-        <w:t>- Created table “</w:t>
-      </w:r>
-      <w:r>
-        <w:t>transactions</w:t>
-      </w:r>
-      <w:r>
-        <w:t>”</w:t>
+        <w:t>- Created table “transactions”</w:t>
       </w:r>
       <w:r>
         <w:t xml:space="preserve"> which had Id as a primary key</w:t>
@@ -202,7 +196,50 @@
     </w:p>
     <w:p>
       <w:r>
-        <w:t>-Add basic view/add rows to transactions table with python and sqlite3 library.</w:t>
+        <w:t>-Add</w:t>
+      </w:r>
+      <w:r>
+        <w:t>ed</w:t>
+      </w:r>
+      <w:r>
+        <w:t xml:space="preserve"> basic view/add rows to transactions table with python and sqlite3 library.</w:t>
+      </w:r>
+    </w:p>
+    <w:p/>
+    <w:p>
+      <w:r>
+        <w:t xml:space="preserve">Second commit </w:t>
+      </w:r>
+      <w:hyperlink r:id="rId6" w:history="1">
+        <w:r>
+          <w:rPr>
+            <w:rStyle w:val="ae"/>
+          </w:rPr>
+          <w:t xml:space="preserve">Add feature to show specific type and handle some errors · </w:t>
+        </w:r>
+        <w:proofErr w:type="spellStart"/>
+        <w:r>
+          <w:rPr>
+            <w:rStyle w:val="ae"/>
+          </w:rPr>
+          <w:t>nemoirisgurl</w:t>
+        </w:r>
+        <w:proofErr w:type="spellEnd"/>
+        <w:r>
+          <w:rPr>
+            <w:rStyle w:val="ae"/>
+          </w:rPr>
+          <w:t>/finance@04021fa</w:t>
+        </w:r>
+      </w:hyperlink>
+      <w:r>
+        <w:br/>
+        <w:t>-Added choices to show only income or expense.</w:t>
+      </w:r>
+    </w:p>
+    <w:p>
+      <w:r>
+        <w:t>-Handled basic errors like no columns or uninitialized database.</w:t>
       </w:r>
     </w:p>
     <w:p/>

</xml_diff>